<commit_message>
ISP-92_change privacy policy file_Ichimaru
</commit_message>
<xml_diff>
--- a/frontend/public/privacypolicy.docx
+++ b/frontend/public/privacypolicy.docx
@@ -4,12 +4,11 @@
   <w:body>
     <w:p>
       <w:pPr>
-        <w:ind w:firstLine="1"/>
         <w:rPr>
           <w:b/>
           <w:bCs/>
           <w:sz w:val="24"/>
-          <w:szCs w:val="28"/>
+          <w:szCs w:val="24"/>
         </w:rPr>
       </w:pPr>
       <w:r>
@@ -17,7 +16,7 @@
           <w:b/>
           <w:bCs/>
           <w:sz w:val="24"/>
-          <w:szCs w:val="28"/>
+          <w:szCs w:val="24"/>
         </w:rPr>
         <w:t>PRIVACY POLICY</w:t>
       </w:r>
@@ -30,15 +29,7 @@
     <w:p/>
     <w:p>
       <w:r>
-        <w:t xml:space="preserve">This privacy notice for </w:t>
-      </w:r>
-      <w:proofErr w:type="spellStart"/>
-      <w:r>
-        <w:t>Tomodachi</w:t>
-      </w:r>
-      <w:proofErr w:type="spellEnd"/>
-      <w:r>
-        <w:t xml:space="preserve"> ("</w:t>
+        <w:t>This privacy notice for Tomodachi ("</w:t>
       </w:r>
       <w:r>
         <w:rPr>
@@ -538,7 +529,6 @@
     <w:p>
       <w:pPr>
         <w:rPr>
-          <w:rFonts w:hint="eastAsia"/>
           <w:b/>
           <w:bCs/>
         </w:rPr>
@@ -1097,13 +1087,7 @@
         <w:t>We may process information about how you use our Services to better understand how they are being used so we can improve them.</w:t>
       </w:r>
     </w:p>
-    <w:p>
-      <w:pPr>
-        <w:rPr>
-          <w:rFonts w:hint="eastAsia"/>
-        </w:rPr>
-      </w:pPr>
-    </w:p>
+    <w:p/>
     <w:p>
       <w:pPr>
         <w:rPr>
@@ -1181,28 +1165,10 @@
         <w:t xml:space="preserve"> </w:t>
       </w:r>
       <w:r>
-        <w:t>When you share personal information (for example, by posting comments, contributions, or other content to the Services) or otherwise interact with public areas of the Services, such personal information may be viewed by all users and may be publicly made available outside the Services in perpetuity.</w:t>
-      </w:r>
-      <w:r>
-        <w:t xml:space="preserve"> </w:t>
-      </w:r>
-      <w:r>
-        <w:t>If you interact with other users of our Services and register for our Services through a social network (such as Facebook), your contacts on the social network will see your name, profile photo, and descriptions of your activity.</w:t>
-      </w:r>
-      <w:r>
-        <w:t xml:space="preserve"> </w:t>
-      </w:r>
-      <w:r>
-        <w:t>Similarly, other users will be able to view descriptions of your activity, communicate with you within our Services, and view your profile.</w:t>
-      </w:r>
-    </w:p>
-    <w:p>
-      <w:pPr>
-        <w:rPr>
-          <w:rFonts w:hint="eastAsia"/>
-        </w:rPr>
-      </w:pPr>
-    </w:p>
+        <w:t>When you share personal information (for example, by posting comments, contributions, or other content to the Services) or otherwise interact with public areas of the Services, such personal information may be viewed by all users and may be publicly made available outside the Services in perpetuity. If you interact with other users of our Services and register for our Services through a social network (such as Facebook), your contacts on the social network will see your name, profile photo, and descriptions of your activity. Similarly, other users will be able to view descriptions of your activity, communicate with you within our Services, and view your profile.</w:t>
+      </w:r>
+    </w:p>
+    <w:p/>
     <w:p>
       <w:pPr>
         <w:rPr>
@@ -1224,13 +1190,7 @@
     </w:p>
     <w:p>
       <w:r>
-        <w:t>In Short:</w:t>
-      </w:r>
-      <w:r>
-        <w:t xml:space="preserve"> </w:t>
-      </w:r>
-      <w:r>
-        <w:t>We may use cookies and other tracking technologies to collect and store your information.</w:t>
+        <w:t>In Short: We may use cookies and other tracking technologies to collect and store your information.</w:t>
       </w:r>
     </w:p>
     <w:p/>
@@ -1311,64 +1271,22 @@
     </w:p>
     <w:p>
       <w:r>
-        <w:t>In Short:</w:t>
-      </w:r>
-      <w:r>
-        <w:t xml:space="preserve"> </w:t>
-      </w:r>
-      <w:r>
-        <w:t>We keep your information for as long as necessary to</w:t>
-      </w:r>
-      <w:r>
-        <w:rPr>
-          <w:rFonts w:hint="eastAsia"/>
-        </w:rPr>
-        <w:t xml:space="preserve"> </w:t>
-      </w:r>
-      <w:r>
-        <w:t>f</w:t>
-      </w:r>
-      <w:r>
-        <w:t>ulfill</w:t>
-      </w:r>
-      <w:r>
-        <w:t xml:space="preserve"> </w:t>
-      </w:r>
-      <w:r>
-        <w:t>the purposes outlined in this privacy notice unless otherwise required by law.</w:t>
-      </w:r>
-    </w:p>
-    <w:p/>
-    <w:p>
-      <w:r>
-        <w:t>We will only keep your personal information for as long as it is necessary for the purposes set out in this privacy notice, unless a longer retention period is required or permitted by law (such as tax, accounting, or other legal requirements).</w:t>
-      </w:r>
-      <w:r>
-        <w:rPr>
-          <w:rFonts w:hint="eastAsia"/>
-        </w:rPr>
-        <w:t xml:space="preserve"> </w:t>
-      </w:r>
-      <w:r>
-        <w:t>No purpose in this notice will require us keeping your personal information for longer than</w:t>
-      </w:r>
-      <w:r>
-        <w:rPr>
-          <w:rFonts w:hint="eastAsia"/>
-        </w:rPr>
-        <w:t xml:space="preserve"> </w:t>
-      </w:r>
-      <w:r>
-        <w:t>__________</w:t>
-      </w:r>
-      <w:r>
-        <w:rPr>
-          <w:rFonts w:hint="eastAsia"/>
-        </w:rPr>
-        <w:t xml:space="preserve"> </w:t>
-      </w:r>
-      <w:r>
-        <w:t>months past the start of the idle period of the user's account.</w:t>
+        <w:t>In Short: We keep your information for as long as necessary to</w:t>
+      </w:r>
+      <w:r>
+        <w:rPr>
+          <w:rFonts w:hint="eastAsia"/>
+        </w:rPr>
+        <w:t xml:space="preserve"> </w:t>
+      </w:r>
+      <w:r>
+        <w:t>fulfill the purposes outlined in this privacy notice unless otherwise required by law.</w:t>
+      </w:r>
+    </w:p>
+    <w:p/>
+    <w:p>
+      <w:r>
+        <w:t>We will only keep your personal information for as long as it is necessary for the purposes set out in this privacy notice, unless a longer retention period is required or permitted by law (such as tax, accounting, or other legal requirements). No purpose in this notice will require us keeping your personal information for longer than 6 months past the start of the idle period of the user's account.</w:t>
       </w:r>
     </w:p>
     <w:p/>
@@ -1482,19 +1400,7 @@
         <w:t xml:space="preserve"> </w:t>
       </w:r>
       <w:r>
-        <w:t>you have the right to</w:t>
-      </w:r>
-      <w:r>
-        <w:t xml:space="preserve"> </w:t>
-      </w:r>
-      <w:r>
-        <w:t>withdraw your consent at any time. You can withdraw your consent at any time by contacting us by</w:t>
-      </w:r>
-      <w:r>
-        <w:t xml:space="preserve"> </w:t>
-      </w:r>
-      <w:r>
-        <w:t>using the contact details provided in the section "HOW CAN YOU CONTACT US ABOUT THISNOTICE?" below.</w:t>
+        <w:t>you have the right to withdraw your consent at any time. You can withdraw your consent at any time by contacting us by using the contact details provided in the section "HOW CAN YOU CONTACT US ABOUT THISNOTICE?" below.</w:t>
       </w:r>
     </w:p>
     <w:p/>
@@ -1505,13 +1411,8 @@
     </w:p>
     <w:p>
       <w:r>
-        <w:t xml:space="preserve">will it affect the processing of your personal information conducted in reliance on lawful processing grounds other than </w:t>
-      </w:r>
-      <w:proofErr w:type="gramStart"/>
-      <w:r>
-        <w:t>consent.</w:t>
-      </w:r>
-      <w:proofErr w:type="gramEnd"/>
+        <w:t>will it affect the processing of your personal information conducted in reliance on lawful processing grounds other than consent.</w:t>
+      </w:r>
     </w:p>
     <w:p/>
     <w:p>
@@ -1539,22 +1440,10 @@
       </w:pPr>
       <w:r>
         <w:lastRenderedPageBreak/>
-        <w:t>Log in to your account settings and update your user account.</w:t>
-      </w:r>
-      <w:r>
-        <w:t xml:space="preserve"> </w:t>
-      </w:r>
-      <w:r>
-        <w:t>Upon your request to terminate your account, we will deactivate or delete your account and information from our active databases. However, we may retain some information in our files to prevent fraud, troubleshoot problems, assist with any investigations, enforce our legal terms and/or comply with applicable legal requirements.</w:t>
-      </w:r>
-    </w:p>
-    <w:p>
-      <w:pPr>
-        <w:rPr>
-          <w:rFonts w:hint="eastAsia"/>
-        </w:rPr>
-      </w:pPr>
-    </w:p>
+        <w:t>Log in to your account settings and update your user account. Upon your request to terminate your account, we will deactivate or delete your account and information from our active databases. However, we may retain some information in our files to prevent fraud, troubleshoot problems, assist with any investigations, enforce our legal terms and/or comply with applicable legal requirements.</w:t>
+      </w:r>
+    </w:p>
+    <w:p/>
     <w:p>
       <w:r>
         <w:rPr>
@@ -1591,13 +1480,7 @@
         <w:t>If you have questions or comments about your privacy rights, you may email us at sic-agile-third@hhq.suzuki.co.jp.</w:t>
       </w:r>
     </w:p>
-    <w:p>
-      <w:pPr>
-        <w:rPr>
-          <w:rFonts w:hint="eastAsia"/>
-        </w:rPr>
-      </w:pPr>
-    </w:p>
+    <w:p/>
     <w:p>
       <w:pPr>
         <w:rPr>
@@ -1696,49 +1579,21 @@
     </w:p>
     <w:p>
       <w:r>
-        <w:t>If you have questions or comments about this notice, you may</w:t>
-      </w:r>
-      <w:r>
-        <w:rPr>
-          <w:rFonts w:hint="eastAsia"/>
-        </w:rPr>
-        <w:t xml:space="preserve"> </w:t>
-      </w:r>
-      <w:r>
-        <w:t xml:space="preserve">email us at </w:t>
-      </w:r>
-      <w:r>
-        <w:t>sic-agile-third@hhq.suzuki.co.jp</w:t>
-      </w:r>
-      <w:r>
-        <w:t xml:space="preserve"> or contact us by post at:</w:t>
-      </w:r>
-    </w:p>
-    <w:p/>
-    <w:p>
-      <w:proofErr w:type="spellStart"/>
-      <w:r>
-        <w:t>Tomodachi</w:t>
-      </w:r>
-      <w:proofErr w:type="spellEnd"/>
-    </w:p>
-    <w:p>
-      <w:r>
-        <w:t>__________</w:t>
-      </w:r>
-    </w:p>
-    <w:p>
-      <w:r>
-        <w:t>__________</w:t>
-      </w:r>
-    </w:p>
-    <w:p>
-      <w:pPr>
-        <w:rPr>
-          <w:rFonts w:hint="eastAsia"/>
-        </w:rPr>
-      </w:pPr>
-    </w:p>
+        <w:t xml:space="preserve">If you have questions or comments about this notice, you may email us at </w:t>
+      </w:r>
+      <w:hyperlink r:id="rId6">
+        <w:r>
+          <w:rPr>
+            <w:rStyle w:val="a4"/>
+          </w:rPr>
+          <w:t>sic-agile-third@hhq.suzuki.co.jp</w:t>
+        </w:r>
+      </w:hyperlink>
+      <w:r>
+        <w:t>.</w:t>
+      </w:r>
+    </w:p>
+    <w:p/>
     <w:p>
       <w:pPr>
         <w:rPr>
@@ -1783,23 +1638,10 @@
     <w:p/>
     <w:p>
       <w:r>
-        <w:t xml:space="preserve">This privacy policy was created using </w:t>
-      </w:r>
-      <w:proofErr w:type="spellStart"/>
-      <w:r>
-        <w:t>Termly's</w:t>
-      </w:r>
-      <w:proofErr w:type="spellEnd"/>
-      <w:r>
-        <w:t xml:space="preserve"> Privacy Policy Generator</w:t>
-      </w:r>
-    </w:p>
-    <w:p>
-      <w:pPr>
-        <w:rPr>
-          <w:rFonts w:hint="eastAsia"/>
-        </w:rPr>
-      </w:pPr>
+        <w:t>This privacy policy was created using Termly's Privacy Policy Generator</w:t>
+      </w:r>
+    </w:p>
+    <w:p>
       <w:r>
         <w:t>.</w:t>
       </w:r>

</xml_diff>